<commit_message>
feat: ajustes no frontend e estrutura inicial para integração com backend
</commit_message>
<xml_diff>
--- a/conteudo site.docx
+++ b/conteudo site.docx
@@ -15,7 +15,7 @@
     <w:p>
       <w:r>
         <w:pict w14:anchorId="57932555">
-          <v:rect id="_x0000_i1055" style="width:0;height:1.5pt" o:hralign="center" o:hrstd="t" o:hrnoshade="t" o:hr="t" fillcolor="gray" stroked="f"/>
+          <v:rect id="_x0000_i1025" style="width:0;height:1.5pt" o:hralign="center" o:hrstd="t" o:hrnoshade="t" o:hr="t" fillcolor="gray" stroked="f"/>
         </w:pict>
       </w:r>
     </w:p>
@@ -206,7 +206,7 @@
     <w:p>
       <w:r>
         <w:pict w14:anchorId="430C2397">
-          <v:rect id="_x0000_i1056" style="width:0;height:1.5pt" o:hralign="center" o:hrstd="t" o:hrnoshade="t" o:hr="t" fillcolor="gray" stroked="f"/>
+          <v:rect id="_x0000_i1026" style="width:0;height:1.5pt" o:hralign="center" o:hrstd="t" o:hrnoshade="t" o:hr="t" fillcolor="gray" stroked="f"/>
         </w:pict>
       </w:r>
     </w:p>
@@ -380,7 +380,7 @@
     <w:p>
       <w:r>
         <w:pict w14:anchorId="43BE3F68">
-          <v:rect id="_x0000_i1057" style="width:0;height:1.5pt" o:hralign="center" o:hrstd="t" o:hrnoshade="t" o:hr="t" fillcolor="gray" stroked="f"/>
+          <v:rect id="_x0000_i1027" style="width:0;height:1.5pt" o:hralign="center" o:hrstd="t" o:hrnoshade="t" o:hr="t" fillcolor="gray" stroked="f"/>
         </w:pict>
       </w:r>
     </w:p>
@@ -518,7 +518,7 @@
     <w:p>
       <w:r>
         <w:pict w14:anchorId="749353AB">
-          <v:rect id="_x0000_i1058" style="width:0;height:1.5pt" o:hralign="center" o:hrstd="t" o:hrnoshade="t" o:hr="t" fillcolor="gray" stroked="f"/>
+          <v:rect id="_x0000_i1028" style="width:0;height:1.5pt" o:hralign="center" o:hrstd="t" o:hrnoshade="t" o:hr="t" fillcolor="gray" stroked="f"/>
         </w:pict>
       </w:r>
     </w:p>
@@ -558,23 +558,7 @@
           <w:b/>
           <w:bCs/>
         </w:rPr>
-        <w:t xml:space="preserve">Pronto </w:t>
-      </w:r>
-      <w:proofErr w:type="gramStart"/>
-      <w:r>
-        <w:rPr>
-          <w:b/>
-          <w:bCs/>
-        </w:rPr>
-        <w:t>para Inovar</w:t>
-      </w:r>
-      <w:proofErr w:type="gramEnd"/>
-      <w:r>
-        <w:rPr>
-          <w:b/>
-          <w:bCs/>
-        </w:rPr>
-        <w:t>? Construa o Futuro Digital do Seu Negócio Conosco.</w:t>
+        <w:t>Pronto para Inovar? Construa o Futuro Digital do Seu Negócio Conosco.</w:t>
       </w:r>
     </w:p>
     <w:p>
@@ -624,7 +608,7 @@
     <w:p>
       <w:r>
         <w:pict w14:anchorId="52FDAD9F">
-          <v:rect id="_x0000_i1059" style="width:0;height:1.5pt" o:hralign="center" o:hrstd="t" o:hrnoshade="t" o:hr="t" fillcolor="gray" stroked="f"/>
+          <v:rect id="_x0000_i1029" style="width:0;height:1.5pt" o:hralign="center" o:hrstd="t" o:hrnoshade="t" o:hr="t" fillcolor="gray" stroked="f"/>
         </w:pict>
       </w:r>
     </w:p>
@@ -641,6 +625,310 @@
         <w:t xml:space="preserve"> Tech oferece. Qual desses textos você mais gostou? Tem alguma outra página que precisa de um toque especial?</w:t>
       </w:r>
     </w:p>
+    <w:p/>
+    <w:p>
+      <w:proofErr w:type="spellStart"/>
+      <w:r>
+        <w:t>Proximos</w:t>
+      </w:r>
+      <w:proofErr w:type="spellEnd"/>
+      <w:r>
+        <w:t xml:space="preserve"> passos da </w:t>
+      </w:r>
+      <w:proofErr w:type="spellStart"/>
+      <w:r>
+        <w:t>page</w:t>
+      </w:r>
+      <w:proofErr w:type="spellEnd"/>
+      <w:r>
+        <w:t xml:space="preserve"> home</w:t>
+      </w:r>
+    </w:p>
+    <w:p>
+      <w:pPr>
+        <w:rPr>
+          <w:b/>
+          <w:bCs/>
+        </w:rPr>
+      </w:pPr>
+      <w:r>
+        <w:rPr>
+          <w:b/>
+          <w:bCs/>
+        </w:rPr>
+        <w:t>3. Interatividade na Home: o que podemos criar</w:t>
+      </w:r>
+    </w:p>
+    <w:p>
+      <w:r>
+        <w:t>Aqui vão ideias para tornar a Home mais interativa e personalizada para o cliente:</w:t>
+      </w:r>
+    </w:p>
+    <w:p>
+      <w:pPr>
+        <w:rPr>
+          <w:b/>
+          <w:bCs/>
+        </w:rPr>
+      </w:pPr>
+      <w:r>
+        <w:rPr>
+          <w:rFonts w:ascii="Segoe UI Emoji" w:hAnsi="Segoe UI Emoji" w:cs="Segoe UI Emoji"/>
+          <w:b/>
+          <w:bCs/>
+        </w:rPr>
+        <w:t>💬</w:t>
+      </w:r>
+      <w:r>
+        <w:rPr>
+          <w:b/>
+          <w:bCs/>
+        </w:rPr>
+        <w:t xml:space="preserve"> Conteúdo dinâmico</w:t>
+      </w:r>
+    </w:p>
+    <w:p>
+      <w:pPr>
+        <w:numPr>
+          <w:ilvl w:val="0"/>
+          <w:numId w:val="5"/>
+        </w:numPr>
+      </w:pPr>
+      <w:r>
+        <w:t>“Olá, Clayton! Aqui estão suas últimas interações.”</w:t>
+      </w:r>
+    </w:p>
+    <w:p>
+      <w:pPr>
+        <w:numPr>
+          <w:ilvl w:val="0"/>
+          <w:numId w:val="5"/>
+        </w:numPr>
+      </w:pPr>
+      <w:r>
+        <w:t>Mostrar projetos recentes, status de pedidos, ou notificações.</w:t>
+      </w:r>
+    </w:p>
+    <w:p>
+      <w:pPr>
+        <w:rPr>
+          <w:b/>
+          <w:bCs/>
+        </w:rPr>
+      </w:pPr>
+      <w:r>
+        <w:rPr>
+          <w:rFonts w:ascii="Segoe UI Emoji" w:hAnsi="Segoe UI Emoji" w:cs="Segoe UI Emoji"/>
+          <w:b/>
+          <w:bCs/>
+        </w:rPr>
+        <w:t>📊</w:t>
+      </w:r>
+      <w:r>
+        <w:rPr>
+          <w:b/>
+          <w:bCs/>
+        </w:rPr>
+        <w:t xml:space="preserve"> Dashboard leve</w:t>
+      </w:r>
+    </w:p>
+    <w:p>
+      <w:pPr>
+        <w:numPr>
+          <w:ilvl w:val="0"/>
+          <w:numId w:val="6"/>
+        </w:numPr>
+      </w:pPr>
+      <w:r>
+        <w:lastRenderedPageBreak/>
+        <w:t>Cards com métricas: “Projetos em andamento”, “Solicitações abertas”, “Último acesso”.</w:t>
+      </w:r>
+    </w:p>
+    <w:p>
+      <w:pPr>
+        <w:numPr>
+          <w:ilvl w:val="0"/>
+          <w:numId w:val="6"/>
+        </w:numPr>
+      </w:pPr>
+      <w:r>
+        <w:t>Gráficos simples com progresso ou histórico.</w:t>
+      </w:r>
+    </w:p>
+    <w:p>
+      <w:pPr>
+        <w:rPr>
+          <w:b/>
+          <w:bCs/>
+        </w:rPr>
+      </w:pPr>
+      <w:r>
+        <w:rPr>
+          <w:rFonts w:ascii="Segoe UI Emoji" w:hAnsi="Segoe UI Emoji" w:cs="Segoe UI Emoji"/>
+          <w:b/>
+          <w:bCs/>
+        </w:rPr>
+        <w:t>🧩</w:t>
+      </w:r>
+      <w:r>
+        <w:rPr>
+          <w:b/>
+          <w:bCs/>
+        </w:rPr>
+        <w:t xml:space="preserve"> Recomendações inteligentes</w:t>
+      </w:r>
+    </w:p>
+    <w:p>
+      <w:pPr>
+        <w:numPr>
+          <w:ilvl w:val="0"/>
+          <w:numId w:val="7"/>
+        </w:numPr>
+      </w:pPr>
+      <w:r>
+        <w:t>Sugestões de serviços com base no perfil do cliente.</w:t>
+      </w:r>
+    </w:p>
+    <w:p>
+      <w:pPr>
+        <w:numPr>
+          <w:ilvl w:val="0"/>
+          <w:numId w:val="7"/>
+        </w:numPr>
+      </w:pPr>
+      <w:r>
+        <w:t>“Você pode gostar de…” com links para funcionalidades.</w:t>
+      </w:r>
+    </w:p>
+    <w:p>
+      <w:pPr>
+        <w:rPr>
+          <w:b/>
+          <w:bCs/>
+        </w:rPr>
+      </w:pPr>
+      <w:r>
+        <w:rPr>
+          <w:rFonts w:ascii="Segoe UI Emoji" w:hAnsi="Segoe UI Emoji" w:cs="Segoe UI Emoji"/>
+          <w:b/>
+          <w:bCs/>
+        </w:rPr>
+        <w:t>🛠️</w:t>
+      </w:r>
+      <w:r>
+        <w:rPr>
+          <w:b/>
+          <w:bCs/>
+        </w:rPr>
+        <w:t xml:space="preserve"> Ações rápidas</w:t>
+      </w:r>
+    </w:p>
+    <w:p>
+      <w:pPr>
+        <w:numPr>
+          <w:ilvl w:val="0"/>
+          <w:numId w:val="8"/>
+        </w:numPr>
+      </w:pPr>
+      <w:r>
+        <w:t>Botões para “Solicitar novo projeto”, “Agendar reunião”, “Enviar feedback”.</w:t>
+      </w:r>
+    </w:p>
+    <w:p>
+      <w:pPr>
+        <w:numPr>
+          <w:ilvl w:val="0"/>
+          <w:numId w:val="8"/>
+        </w:numPr>
+      </w:pPr>
+      <w:r>
+        <w:t>Integração com WhatsApp ou chat interno.</w:t>
+      </w:r>
+    </w:p>
+    <w:p>
+      <w:pPr>
+        <w:rPr>
+          <w:b/>
+          <w:bCs/>
+        </w:rPr>
+      </w:pPr>
+      <w:r>
+        <w:rPr>
+          <w:rFonts w:ascii="Segoe UI Emoji" w:hAnsi="Segoe UI Emoji" w:cs="Segoe UI Emoji"/>
+          <w:b/>
+          <w:bCs/>
+        </w:rPr>
+        <w:t>🎨</w:t>
+      </w:r>
+      <w:r>
+        <w:rPr>
+          <w:b/>
+          <w:bCs/>
+        </w:rPr>
+        <w:t xml:space="preserve"> Personalização visual</w:t>
+      </w:r>
+    </w:p>
+    <w:p>
+      <w:pPr>
+        <w:numPr>
+          <w:ilvl w:val="0"/>
+          <w:numId w:val="9"/>
+        </w:numPr>
+      </w:pPr>
+      <w:r>
+        <w:t>Mostrar avatar ou imagem do cliente.</w:t>
+      </w:r>
+    </w:p>
+    <w:p>
+      <w:pPr>
+        <w:numPr>
+          <w:ilvl w:val="0"/>
+          <w:numId w:val="9"/>
+        </w:numPr>
+      </w:pPr>
+      <w:r>
+        <w:t>Temas ou frases de boas-vindas ajustadas ao perfil.</w:t>
+      </w:r>
+    </w:p>
+    <w:p>
+      <w:r>
+        <w:t xml:space="preserve">Se quiser, posso te ajudar a criar um </w:t>
+      </w:r>
+      <w:proofErr w:type="spellStart"/>
+      <w:r>
+        <w:rPr>
+          <w:b/>
+          <w:bCs/>
+        </w:rPr>
+        <w:t>mockup</w:t>
+      </w:r>
+      <w:proofErr w:type="spellEnd"/>
+      <w:r>
+        <w:rPr>
+          <w:b/>
+          <w:bCs/>
+        </w:rPr>
+        <w:t xml:space="preserve"> funcional da Home personalizada</w:t>
+      </w:r>
+      <w:r>
+        <w:t xml:space="preserve">, ou começar a montar o </w:t>
+      </w:r>
+      <w:proofErr w:type="spellStart"/>
+      <w:r>
+        <w:t>backend</w:t>
+      </w:r>
+      <w:proofErr w:type="spellEnd"/>
+      <w:r>
+        <w:t xml:space="preserve"> com PostgreSQL e autenticação real. Qual dessas frentes você quer atacar primeiro? Vamos deixar essa experiência memorável! </w:t>
+      </w:r>
+      <w:r>
+        <w:rPr>
+          <w:rFonts w:ascii="Segoe UI Emoji" w:hAnsi="Segoe UI Emoji" w:cs="Segoe UI Emoji"/>
+        </w:rPr>
+        <w:t>💼✨</w:t>
+      </w:r>
+    </w:p>
+    <w:p/>
     <w:p/>
     <w:sectPr>
       <w:pgSz w:w="11906" w:h="16838"/>
@@ -655,6 +943,304 @@
 <file path=word/numbering.xml><?xml version="1.0" encoding="utf-8"?>
 <w:numbering xmlns:wpc="http://schemas.microsoft.com/office/word/2010/wordprocessingCanvas" xmlns:cx="http://schemas.microsoft.com/office/drawing/2014/chartex" xmlns:cx1="http://schemas.microsoft.com/office/drawing/2015/9/8/chartex" xmlns:cx2="http://schemas.microsoft.com/office/drawing/2015/10/21/chartex" xmlns:cx3="http://schemas.microsoft.com/office/drawing/2016/5/9/chartex" xmlns:cx4="http://schemas.microsoft.com/office/drawing/2016/5/10/chartex" xmlns:cx5="http://schemas.microsoft.com/office/drawing/2016/5/11/chartex" xmlns:cx6="http://schemas.microsoft.com/office/drawing/2016/5/12/chartex" xmlns:cx7="http://schemas.microsoft.com/office/drawing/2016/5/13/chartex" xmlns:cx8="http://schemas.microsoft.com/office/drawing/2016/5/14/chartex" xmlns:mc="http://schemas.openxmlformats.org/markup-compatibility/2006" xmlns:aink="http://schemas.microsoft.com/office/drawing/2016/ink" xmlns:am3d="http://schemas.microsoft.com/office/drawing/2017/model3d" xmlns:o="urn:schemas-microsoft-com:office:office" xmlns:oel="http://schemas.microsoft.com/office/2019/extlst" xmlns:r="http://schemas.openxmlformats.org/officeDocument/2006/relationships" xmlns:m="http://schemas.openxmlformats.org/officeDocument/2006/math" xmlns:v="urn:schemas-microsoft-com:vml" xmlns:wp14="http://schemas.microsoft.com/office/word/2010/wordprocessingDrawing" xmlns:wp="http://schemas.openxmlformats.org/drawingml/2006/wordprocessingDrawing" xmlns:w10="urn:schemas-microsoft-com:office:word" xmlns:w="http://schemas.openxmlformats.org/wordprocessingml/2006/main" xmlns:w14="http://schemas.microsoft.com/office/word/2010/wordml" xmlns:w15="http://schemas.microsoft.com/office/word/2012/wordml" xmlns:w16cex="http://schemas.microsoft.com/office/word/2018/wordml/cex" xmlns:w16cid="http://schemas.microsoft.com/office/word/2016/wordml/cid" xmlns:w16="http://schemas.microsoft.com/office/word/2018/wordml" xmlns:w16du="http://schemas.microsoft.com/office/word/2023/wordml/word16du" xmlns:w16sdtdh="http://schemas.microsoft.com/office/word/2020/wordml/sdtdatahash" xmlns:w16sdtfl="http://schemas.microsoft.com/office/word/2024/wordml/sdtformatlock" xmlns:w16se="http://schemas.microsoft.com/office/word/2015/wordml/symex" xmlns:wpg="http://schemas.microsoft.com/office/word/2010/wordprocessingGroup" xmlns:wpi="http://schemas.microsoft.com/office/word/2010/wordprocessingInk" xmlns:wne="http://schemas.microsoft.com/office/word/2006/wordml" xmlns:wps="http://schemas.microsoft.com/office/word/2010/wordprocessingShape" mc:Ignorable="w14 w15 w16se w16cid w16 w16cex w16sdtdh w16sdtfl w16du wp14">
   <w:abstractNum w:abstractNumId="0" w15:restartNumberingAfterBreak="0">
+    <w:nsid w:val="04654455"/>
+    <w:multiLevelType w:val="multilevel"/>
+    <w:tmpl w:val="7E5C0C20"/>
+    <w:lvl w:ilvl="0">
+      <w:start w:val="1"/>
+      <w:numFmt w:val="bullet"/>
+      <w:lvlText w:val=""/>
+      <w:lvlJc w:val="left"/>
+      <w:pPr>
+        <w:tabs>
+          <w:tab w:val="num" w:pos="720"/>
+        </w:tabs>
+        <w:ind w:left="720" w:hanging="360"/>
+      </w:pPr>
+      <w:rPr>
+        <w:rFonts w:ascii="Symbol" w:hAnsi="Symbol" w:hint="default"/>
+        <w:sz w:val="20"/>
+      </w:rPr>
+    </w:lvl>
+    <w:lvl w:ilvl="1" w:tentative="1">
+      <w:start w:val="1"/>
+      <w:numFmt w:val="bullet"/>
+      <w:lvlText w:val="o"/>
+      <w:lvlJc w:val="left"/>
+      <w:pPr>
+        <w:tabs>
+          <w:tab w:val="num" w:pos="1440"/>
+        </w:tabs>
+        <w:ind w:left="1440" w:hanging="360"/>
+      </w:pPr>
+      <w:rPr>
+        <w:rFonts w:ascii="Courier New" w:hAnsi="Courier New" w:hint="default"/>
+        <w:sz w:val="20"/>
+      </w:rPr>
+    </w:lvl>
+    <w:lvl w:ilvl="2" w:tentative="1">
+      <w:start w:val="1"/>
+      <w:numFmt w:val="bullet"/>
+      <w:lvlText w:val=""/>
+      <w:lvlJc w:val="left"/>
+      <w:pPr>
+        <w:tabs>
+          <w:tab w:val="num" w:pos="2160"/>
+        </w:tabs>
+        <w:ind w:left="2160" w:hanging="360"/>
+      </w:pPr>
+      <w:rPr>
+        <w:rFonts w:ascii="Wingdings" w:hAnsi="Wingdings" w:hint="default"/>
+        <w:sz w:val="20"/>
+      </w:rPr>
+    </w:lvl>
+    <w:lvl w:ilvl="3" w:tentative="1">
+      <w:start w:val="1"/>
+      <w:numFmt w:val="bullet"/>
+      <w:lvlText w:val=""/>
+      <w:lvlJc w:val="left"/>
+      <w:pPr>
+        <w:tabs>
+          <w:tab w:val="num" w:pos="2880"/>
+        </w:tabs>
+        <w:ind w:left="2880" w:hanging="360"/>
+      </w:pPr>
+      <w:rPr>
+        <w:rFonts w:ascii="Wingdings" w:hAnsi="Wingdings" w:hint="default"/>
+        <w:sz w:val="20"/>
+      </w:rPr>
+    </w:lvl>
+    <w:lvl w:ilvl="4" w:tentative="1">
+      <w:start w:val="1"/>
+      <w:numFmt w:val="bullet"/>
+      <w:lvlText w:val=""/>
+      <w:lvlJc w:val="left"/>
+      <w:pPr>
+        <w:tabs>
+          <w:tab w:val="num" w:pos="3600"/>
+        </w:tabs>
+        <w:ind w:left="3600" w:hanging="360"/>
+      </w:pPr>
+      <w:rPr>
+        <w:rFonts w:ascii="Wingdings" w:hAnsi="Wingdings" w:hint="default"/>
+        <w:sz w:val="20"/>
+      </w:rPr>
+    </w:lvl>
+    <w:lvl w:ilvl="5" w:tentative="1">
+      <w:start w:val="1"/>
+      <w:numFmt w:val="bullet"/>
+      <w:lvlText w:val=""/>
+      <w:lvlJc w:val="left"/>
+      <w:pPr>
+        <w:tabs>
+          <w:tab w:val="num" w:pos="4320"/>
+        </w:tabs>
+        <w:ind w:left="4320" w:hanging="360"/>
+      </w:pPr>
+      <w:rPr>
+        <w:rFonts w:ascii="Wingdings" w:hAnsi="Wingdings" w:hint="default"/>
+        <w:sz w:val="20"/>
+      </w:rPr>
+    </w:lvl>
+    <w:lvl w:ilvl="6" w:tentative="1">
+      <w:start w:val="1"/>
+      <w:numFmt w:val="bullet"/>
+      <w:lvlText w:val=""/>
+      <w:lvlJc w:val="left"/>
+      <w:pPr>
+        <w:tabs>
+          <w:tab w:val="num" w:pos="5040"/>
+        </w:tabs>
+        <w:ind w:left="5040" w:hanging="360"/>
+      </w:pPr>
+      <w:rPr>
+        <w:rFonts w:ascii="Wingdings" w:hAnsi="Wingdings" w:hint="default"/>
+        <w:sz w:val="20"/>
+      </w:rPr>
+    </w:lvl>
+    <w:lvl w:ilvl="7" w:tentative="1">
+      <w:start w:val="1"/>
+      <w:numFmt w:val="bullet"/>
+      <w:lvlText w:val=""/>
+      <w:lvlJc w:val="left"/>
+      <w:pPr>
+        <w:tabs>
+          <w:tab w:val="num" w:pos="5760"/>
+        </w:tabs>
+        <w:ind w:left="5760" w:hanging="360"/>
+      </w:pPr>
+      <w:rPr>
+        <w:rFonts w:ascii="Wingdings" w:hAnsi="Wingdings" w:hint="default"/>
+        <w:sz w:val="20"/>
+      </w:rPr>
+    </w:lvl>
+    <w:lvl w:ilvl="8" w:tentative="1">
+      <w:start w:val="1"/>
+      <w:numFmt w:val="bullet"/>
+      <w:lvlText w:val=""/>
+      <w:lvlJc w:val="left"/>
+      <w:pPr>
+        <w:tabs>
+          <w:tab w:val="num" w:pos="6480"/>
+        </w:tabs>
+        <w:ind w:left="6480" w:hanging="360"/>
+      </w:pPr>
+      <w:rPr>
+        <w:rFonts w:ascii="Wingdings" w:hAnsi="Wingdings" w:hint="default"/>
+        <w:sz w:val="20"/>
+      </w:rPr>
+    </w:lvl>
+  </w:abstractNum>
+  <w:abstractNum w:abstractNumId="1" w15:restartNumberingAfterBreak="0">
+    <w:nsid w:val="0BD50CAB"/>
+    <w:multiLevelType w:val="multilevel"/>
+    <w:tmpl w:val="70304682"/>
+    <w:lvl w:ilvl="0">
+      <w:start w:val="1"/>
+      <w:numFmt w:val="bullet"/>
+      <w:lvlText w:val=""/>
+      <w:lvlJc w:val="left"/>
+      <w:pPr>
+        <w:tabs>
+          <w:tab w:val="num" w:pos="720"/>
+        </w:tabs>
+        <w:ind w:left="720" w:hanging="360"/>
+      </w:pPr>
+      <w:rPr>
+        <w:rFonts w:ascii="Symbol" w:hAnsi="Symbol" w:hint="default"/>
+        <w:sz w:val="20"/>
+      </w:rPr>
+    </w:lvl>
+    <w:lvl w:ilvl="1" w:tentative="1">
+      <w:start w:val="1"/>
+      <w:numFmt w:val="bullet"/>
+      <w:lvlText w:val="o"/>
+      <w:lvlJc w:val="left"/>
+      <w:pPr>
+        <w:tabs>
+          <w:tab w:val="num" w:pos="1440"/>
+        </w:tabs>
+        <w:ind w:left="1440" w:hanging="360"/>
+      </w:pPr>
+      <w:rPr>
+        <w:rFonts w:ascii="Courier New" w:hAnsi="Courier New" w:hint="default"/>
+        <w:sz w:val="20"/>
+      </w:rPr>
+    </w:lvl>
+    <w:lvl w:ilvl="2" w:tentative="1">
+      <w:start w:val="1"/>
+      <w:numFmt w:val="bullet"/>
+      <w:lvlText w:val=""/>
+      <w:lvlJc w:val="left"/>
+      <w:pPr>
+        <w:tabs>
+          <w:tab w:val="num" w:pos="2160"/>
+        </w:tabs>
+        <w:ind w:left="2160" w:hanging="360"/>
+      </w:pPr>
+      <w:rPr>
+        <w:rFonts w:ascii="Wingdings" w:hAnsi="Wingdings" w:hint="default"/>
+        <w:sz w:val="20"/>
+      </w:rPr>
+    </w:lvl>
+    <w:lvl w:ilvl="3" w:tentative="1">
+      <w:start w:val="1"/>
+      <w:numFmt w:val="bullet"/>
+      <w:lvlText w:val=""/>
+      <w:lvlJc w:val="left"/>
+      <w:pPr>
+        <w:tabs>
+          <w:tab w:val="num" w:pos="2880"/>
+        </w:tabs>
+        <w:ind w:left="2880" w:hanging="360"/>
+      </w:pPr>
+      <w:rPr>
+        <w:rFonts w:ascii="Wingdings" w:hAnsi="Wingdings" w:hint="default"/>
+        <w:sz w:val="20"/>
+      </w:rPr>
+    </w:lvl>
+    <w:lvl w:ilvl="4" w:tentative="1">
+      <w:start w:val="1"/>
+      <w:numFmt w:val="bullet"/>
+      <w:lvlText w:val=""/>
+      <w:lvlJc w:val="left"/>
+      <w:pPr>
+        <w:tabs>
+          <w:tab w:val="num" w:pos="3600"/>
+        </w:tabs>
+        <w:ind w:left="3600" w:hanging="360"/>
+      </w:pPr>
+      <w:rPr>
+        <w:rFonts w:ascii="Wingdings" w:hAnsi="Wingdings" w:hint="default"/>
+        <w:sz w:val="20"/>
+      </w:rPr>
+    </w:lvl>
+    <w:lvl w:ilvl="5" w:tentative="1">
+      <w:start w:val="1"/>
+      <w:numFmt w:val="bullet"/>
+      <w:lvlText w:val=""/>
+      <w:lvlJc w:val="left"/>
+      <w:pPr>
+        <w:tabs>
+          <w:tab w:val="num" w:pos="4320"/>
+        </w:tabs>
+        <w:ind w:left="4320" w:hanging="360"/>
+      </w:pPr>
+      <w:rPr>
+        <w:rFonts w:ascii="Wingdings" w:hAnsi="Wingdings" w:hint="default"/>
+        <w:sz w:val="20"/>
+      </w:rPr>
+    </w:lvl>
+    <w:lvl w:ilvl="6" w:tentative="1">
+      <w:start w:val="1"/>
+      <w:numFmt w:val="bullet"/>
+      <w:lvlText w:val=""/>
+      <w:lvlJc w:val="left"/>
+      <w:pPr>
+        <w:tabs>
+          <w:tab w:val="num" w:pos="5040"/>
+        </w:tabs>
+        <w:ind w:left="5040" w:hanging="360"/>
+      </w:pPr>
+      <w:rPr>
+        <w:rFonts w:ascii="Wingdings" w:hAnsi="Wingdings" w:hint="default"/>
+        <w:sz w:val="20"/>
+      </w:rPr>
+    </w:lvl>
+    <w:lvl w:ilvl="7" w:tentative="1">
+      <w:start w:val="1"/>
+      <w:numFmt w:val="bullet"/>
+      <w:lvlText w:val=""/>
+      <w:lvlJc w:val="left"/>
+      <w:pPr>
+        <w:tabs>
+          <w:tab w:val="num" w:pos="5760"/>
+        </w:tabs>
+        <w:ind w:left="5760" w:hanging="360"/>
+      </w:pPr>
+      <w:rPr>
+        <w:rFonts w:ascii="Wingdings" w:hAnsi="Wingdings" w:hint="default"/>
+        <w:sz w:val="20"/>
+      </w:rPr>
+    </w:lvl>
+    <w:lvl w:ilvl="8" w:tentative="1">
+      <w:start w:val="1"/>
+      <w:numFmt w:val="bullet"/>
+      <w:lvlText w:val=""/>
+      <w:lvlJc w:val="left"/>
+      <w:pPr>
+        <w:tabs>
+          <w:tab w:val="num" w:pos="6480"/>
+        </w:tabs>
+        <w:ind w:left="6480" w:hanging="360"/>
+      </w:pPr>
+      <w:rPr>
+        <w:rFonts w:ascii="Wingdings" w:hAnsi="Wingdings" w:hint="default"/>
+        <w:sz w:val="20"/>
+      </w:rPr>
+    </w:lvl>
+  </w:abstractNum>
+  <w:abstractNum w:abstractNumId="2" w15:restartNumberingAfterBreak="0">
     <w:nsid w:val="0DD301ED"/>
     <w:multiLevelType w:val="multilevel"/>
     <w:tmpl w:val="26B68C92"/>
@@ -803,7 +1389,305 @@
       </w:rPr>
     </w:lvl>
   </w:abstractNum>
-  <w:abstractNum w:abstractNumId="1" w15:restartNumberingAfterBreak="0">
+  <w:abstractNum w:abstractNumId="3" w15:restartNumberingAfterBreak="0">
+    <w:nsid w:val="1D49225B"/>
+    <w:multiLevelType w:val="multilevel"/>
+    <w:tmpl w:val="7B201B62"/>
+    <w:lvl w:ilvl="0">
+      <w:start w:val="1"/>
+      <w:numFmt w:val="bullet"/>
+      <w:lvlText w:val=""/>
+      <w:lvlJc w:val="left"/>
+      <w:pPr>
+        <w:tabs>
+          <w:tab w:val="num" w:pos="720"/>
+        </w:tabs>
+        <w:ind w:left="720" w:hanging="360"/>
+      </w:pPr>
+      <w:rPr>
+        <w:rFonts w:ascii="Symbol" w:hAnsi="Symbol" w:hint="default"/>
+        <w:sz w:val="20"/>
+      </w:rPr>
+    </w:lvl>
+    <w:lvl w:ilvl="1" w:tentative="1">
+      <w:start w:val="1"/>
+      <w:numFmt w:val="bullet"/>
+      <w:lvlText w:val="o"/>
+      <w:lvlJc w:val="left"/>
+      <w:pPr>
+        <w:tabs>
+          <w:tab w:val="num" w:pos="1440"/>
+        </w:tabs>
+        <w:ind w:left="1440" w:hanging="360"/>
+      </w:pPr>
+      <w:rPr>
+        <w:rFonts w:ascii="Courier New" w:hAnsi="Courier New" w:hint="default"/>
+        <w:sz w:val="20"/>
+      </w:rPr>
+    </w:lvl>
+    <w:lvl w:ilvl="2" w:tentative="1">
+      <w:start w:val="1"/>
+      <w:numFmt w:val="bullet"/>
+      <w:lvlText w:val=""/>
+      <w:lvlJc w:val="left"/>
+      <w:pPr>
+        <w:tabs>
+          <w:tab w:val="num" w:pos="2160"/>
+        </w:tabs>
+        <w:ind w:left="2160" w:hanging="360"/>
+      </w:pPr>
+      <w:rPr>
+        <w:rFonts w:ascii="Wingdings" w:hAnsi="Wingdings" w:hint="default"/>
+        <w:sz w:val="20"/>
+      </w:rPr>
+    </w:lvl>
+    <w:lvl w:ilvl="3" w:tentative="1">
+      <w:start w:val="1"/>
+      <w:numFmt w:val="bullet"/>
+      <w:lvlText w:val=""/>
+      <w:lvlJc w:val="left"/>
+      <w:pPr>
+        <w:tabs>
+          <w:tab w:val="num" w:pos="2880"/>
+        </w:tabs>
+        <w:ind w:left="2880" w:hanging="360"/>
+      </w:pPr>
+      <w:rPr>
+        <w:rFonts w:ascii="Wingdings" w:hAnsi="Wingdings" w:hint="default"/>
+        <w:sz w:val="20"/>
+      </w:rPr>
+    </w:lvl>
+    <w:lvl w:ilvl="4" w:tentative="1">
+      <w:start w:val="1"/>
+      <w:numFmt w:val="bullet"/>
+      <w:lvlText w:val=""/>
+      <w:lvlJc w:val="left"/>
+      <w:pPr>
+        <w:tabs>
+          <w:tab w:val="num" w:pos="3600"/>
+        </w:tabs>
+        <w:ind w:left="3600" w:hanging="360"/>
+      </w:pPr>
+      <w:rPr>
+        <w:rFonts w:ascii="Wingdings" w:hAnsi="Wingdings" w:hint="default"/>
+        <w:sz w:val="20"/>
+      </w:rPr>
+    </w:lvl>
+    <w:lvl w:ilvl="5" w:tentative="1">
+      <w:start w:val="1"/>
+      <w:numFmt w:val="bullet"/>
+      <w:lvlText w:val=""/>
+      <w:lvlJc w:val="left"/>
+      <w:pPr>
+        <w:tabs>
+          <w:tab w:val="num" w:pos="4320"/>
+        </w:tabs>
+        <w:ind w:left="4320" w:hanging="360"/>
+      </w:pPr>
+      <w:rPr>
+        <w:rFonts w:ascii="Wingdings" w:hAnsi="Wingdings" w:hint="default"/>
+        <w:sz w:val="20"/>
+      </w:rPr>
+    </w:lvl>
+    <w:lvl w:ilvl="6" w:tentative="1">
+      <w:start w:val="1"/>
+      <w:numFmt w:val="bullet"/>
+      <w:lvlText w:val=""/>
+      <w:lvlJc w:val="left"/>
+      <w:pPr>
+        <w:tabs>
+          <w:tab w:val="num" w:pos="5040"/>
+        </w:tabs>
+        <w:ind w:left="5040" w:hanging="360"/>
+      </w:pPr>
+      <w:rPr>
+        <w:rFonts w:ascii="Wingdings" w:hAnsi="Wingdings" w:hint="default"/>
+        <w:sz w:val="20"/>
+      </w:rPr>
+    </w:lvl>
+    <w:lvl w:ilvl="7" w:tentative="1">
+      <w:start w:val="1"/>
+      <w:numFmt w:val="bullet"/>
+      <w:lvlText w:val=""/>
+      <w:lvlJc w:val="left"/>
+      <w:pPr>
+        <w:tabs>
+          <w:tab w:val="num" w:pos="5760"/>
+        </w:tabs>
+        <w:ind w:left="5760" w:hanging="360"/>
+      </w:pPr>
+      <w:rPr>
+        <w:rFonts w:ascii="Wingdings" w:hAnsi="Wingdings" w:hint="default"/>
+        <w:sz w:val="20"/>
+      </w:rPr>
+    </w:lvl>
+    <w:lvl w:ilvl="8" w:tentative="1">
+      <w:start w:val="1"/>
+      <w:numFmt w:val="bullet"/>
+      <w:lvlText w:val=""/>
+      <w:lvlJc w:val="left"/>
+      <w:pPr>
+        <w:tabs>
+          <w:tab w:val="num" w:pos="6480"/>
+        </w:tabs>
+        <w:ind w:left="6480" w:hanging="360"/>
+      </w:pPr>
+      <w:rPr>
+        <w:rFonts w:ascii="Wingdings" w:hAnsi="Wingdings" w:hint="default"/>
+        <w:sz w:val="20"/>
+      </w:rPr>
+    </w:lvl>
+  </w:abstractNum>
+  <w:abstractNum w:abstractNumId="4" w15:restartNumberingAfterBreak="0">
+    <w:nsid w:val="22931B0D"/>
+    <w:multiLevelType w:val="multilevel"/>
+    <w:tmpl w:val="FBEC2E1C"/>
+    <w:lvl w:ilvl="0">
+      <w:start w:val="1"/>
+      <w:numFmt w:val="bullet"/>
+      <w:lvlText w:val=""/>
+      <w:lvlJc w:val="left"/>
+      <w:pPr>
+        <w:tabs>
+          <w:tab w:val="num" w:pos="720"/>
+        </w:tabs>
+        <w:ind w:left="720" w:hanging="360"/>
+      </w:pPr>
+      <w:rPr>
+        <w:rFonts w:ascii="Symbol" w:hAnsi="Symbol" w:hint="default"/>
+        <w:sz w:val="20"/>
+      </w:rPr>
+    </w:lvl>
+    <w:lvl w:ilvl="1" w:tentative="1">
+      <w:start w:val="1"/>
+      <w:numFmt w:val="bullet"/>
+      <w:lvlText w:val="o"/>
+      <w:lvlJc w:val="left"/>
+      <w:pPr>
+        <w:tabs>
+          <w:tab w:val="num" w:pos="1440"/>
+        </w:tabs>
+        <w:ind w:left="1440" w:hanging="360"/>
+      </w:pPr>
+      <w:rPr>
+        <w:rFonts w:ascii="Courier New" w:hAnsi="Courier New" w:hint="default"/>
+        <w:sz w:val="20"/>
+      </w:rPr>
+    </w:lvl>
+    <w:lvl w:ilvl="2" w:tentative="1">
+      <w:start w:val="1"/>
+      <w:numFmt w:val="bullet"/>
+      <w:lvlText w:val=""/>
+      <w:lvlJc w:val="left"/>
+      <w:pPr>
+        <w:tabs>
+          <w:tab w:val="num" w:pos="2160"/>
+        </w:tabs>
+        <w:ind w:left="2160" w:hanging="360"/>
+      </w:pPr>
+      <w:rPr>
+        <w:rFonts w:ascii="Wingdings" w:hAnsi="Wingdings" w:hint="default"/>
+        <w:sz w:val="20"/>
+      </w:rPr>
+    </w:lvl>
+    <w:lvl w:ilvl="3" w:tentative="1">
+      <w:start w:val="1"/>
+      <w:numFmt w:val="bullet"/>
+      <w:lvlText w:val=""/>
+      <w:lvlJc w:val="left"/>
+      <w:pPr>
+        <w:tabs>
+          <w:tab w:val="num" w:pos="2880"/>
+        </w:tabs>
+        <w:ind w:left="2880" w:hanging="360"/>
+      </w:pPr>
+      <w:rPr>
+        <w:rFonts w:ascii="Wingdings" w:hAnsi="Wingdings" w:hint="default"/>
+        <w:sz w:val="20"/>
+      </w:rPr>
+    </w:lvl>
+    <w:lvl w:ilvl="4" w:tentative="1">
+      <w:start w:val="1"/>
+      <w:numFmt w:val="bullet"/>
+      <w:lvlText w:val=""/>
+      <w:lvlJc w:val="left"/>
+      <w:pPr>
+        <w:tabs>
+          <w:tab w:val="num" w:pos="3600"/>
+        </w:tabs>
+        <w:ind w:left="3600" w:hanging="360"/>
+      </w:pPr>
+      <w:rPr>
+        <w:rFonts w:ascii="Wingdings" w:hAnsi="Wingdings" w:hint="default"/>
+        <w:sz w:val="20"/>
+      </w:rPr>
+    </w:lvl>
+    <w:lvl w:ilvl="5" w:tentative="1">
+      <w:start w:val="1"/>
+      <w:numFmt w:val="bullet"/>
+      <w:lvlText w:val=""/>
+      <w:lvlJc w:val="left"/>
+      <w:pPr>
+        <w:tabs>
+          <w:tab w:val="num" w:pos="4320"/>
+        </w:tabs>
+        <w:ind w:left="4320" w:hanging="360"/>
+      </w:pPr>
+      <w:rPr>
+        <w:rFonts w:ascii="Wingdings" w:hAnsi="Wingdings" w:hint="default"/>
+        <w:sz w:val="20"/>
+      </w:rPr>
+    </w:lvl>
+    <w:lvl w:ilvl="6" w:tentative="1">
+      <w:start w:val="1"/>
+      <w:numFmt w:val="bullet"/>
+      <w:lvlText w:val=""/>
+      <w:lvlJc w:val="left"/>
+      <w:pPr>
+        <w:tabs>
+          <w:tab w:val="num" w:pos="5040"/>
+        </w:tabs>
+        <w:ind w:left="5040" w:hanging="360"/>
+      </w:pPr>
+      <w:rPr>
+        <w:rFonts w:ascii="Wingdings" w:hAnsi="Wingdings" w:hint="default"/>
+        <w:sz w:val="20"/>
+      </w:rPr>
+    </w:lvl>
+    <w:lvl w:ilvl="7" w:tentative="1">
+      <w:start w:val="1"/>
+      <w:numFmt w:val="bullet"/>
+      <w:lvlText w:val=""/>
+      <w:lvlJc w:val="left"/>
+      <w:pPr>
+        <w:tabs>
+          <w:tab w:val="num" w:pos="5760"/>
+        </w:tabs>
+        <w:ind w:left="5760" w:hanging="360"/>
+      </w:pPr>
+      <w:rPr>
+        <w:rFonts w:ascii="Wingdings" w:hAnsi="Wingdings" w:hint="default"/>
+        <w:sz w:val="20"/>
+      </w:rPr>
+    </w:lvl>
+    <w:lvl w:ilvl="8" w:tentative="1">
+      <w:start w:val="1"/>
+      <w:numFmt w:val="bullet"/>
+      <w:lvlText w:val=""/>
+      <w:lvlJc w:val="left"/>
+      <w:pPr>
+        <w:tabs>
+          <w:tab w:val="num" w:pos="6480"/>
+        </w:tabs>
+        <w:ind w:left="6480" w:hanging="360"/>
+      </w:pPr>
+      <w:rPr>
+        <w:rFonts w:ascii="Wingdings" w:hAnsi="Wingdings" w:hint="default"/>
+        <w:sz w:val="20"/>
+      </w:rPr>
+    </w:lvl>
+  </w:abstractNum>
+  <w:abstractNum w:abstractNumId="5" w15:restartNumberingAfterBreak="0">
     <w:nsid w:val="263C0BC4"/>
     <w:multiLevelType w:val="multilevel"/>
     <w:tmpl w:val="3F421A32"/>
@@ -952,7 +1836,7 @@
       </w:rPr>
     </w:lvl>
   </w:abstractNum>
-  <w:abstractNum w:abstractNumId="2" w15:restartNumberingAfterBreak="0">
+  <w:abstractNum w:abstractNumId="6" w15:restartNumberingAfterBreak="0">
     <w:nsid w:val="4CFA5D10"/>
     <w:multiLevelType w:val="multilevel"/>
     <w:tmpl w:val="CF72064C"/>
@@ -1101,7 +1985,156 @@
       </w:rPr>
     </w:lvl>
   </w:abstractNum>
-  <w:abstractNum w:abstractNumId="3" w15:restartNumberingAfterBreak="0">
+  <w:abstractNum w:abstractNumId="7" w15:restartNumberingAfterBreak="0">
+    <w:nsid w:val="61525325"/>
+    <w:multiLevelType w:val="multilevel"/>
+    <w:tmpl w:val="01F21324"/>
+    <w:lvl w:ilvl="0">
+      <w:start w:val="1"/>
+      <w:numFmt w:val="bullet"/>
+      <w:lvlText w:val=""/>
+      <w:lvlJc w:val="left"/>
+      <w:pPr>
+        <w:tabs>
+          <w:tab w:val="num" w:pos="720"/>
+        </w:tabs>
+        <w:ind w:left="720" w:hanging="360"/>
+      </w:pPr>
+      <w:rPr>
+        <w:rFonts w:ascii="Symbol" w:hAnsi="Symbol" w:hint="default"/>
+        <w:sz w:val="20"/>
+      </w:rPr>
+    </w:lvl>
+    <w:lvl w:ilvl="1" w:tentative="1">
+      <w:start w:val="1"/>
+      <w:numFmt w:val="bullet"/>
+      <w:lvlText w:val="o"/>
+      <w:lvlJc w:val="left"/>
+      <w:pPr>
+        <w:tabs>
+          <w:tab w:val="num" w:pos="1440"/>
+        </w:tabs>
+        <w:ind w:left="1440" w:hanging="360"/>
+      </w:pPr>
+      <w:rPr>
+        <w:rFonts w:ascii="Courier New" w:hAnsi="Courier New" w:hint="default"/>
+        <w:sz w:val="20"/>
+      </w:rPr>
+    </w:lvl>
+    <w:lvl w:ilvl="2" w:tentative="1">
+      <w:start w:val="1"/>
+      <w:numFmt w:val="bullet"/>
+      <w:lvlText w:val=""/>
+      <w:lvlJc w:val="left"/>
+      <w:pPr>
+        <w:tabs>
+          <w:tab w:val="num" w:pos="2160"/>
+        </w:tabs>
+        <w:ind w:left="2160" w:hanging="360"/>
+      </w:pPr>
+      <w:rPr>
+        <w:rFonts w:ascii="Wingdings" w:hAnsi="Wingdings" w:hint="default"/>
+        <w:sz w:val="20"/>
+      </w:rPr>
+    </w:lvl>
+    <w:lvl w:ilvl="3" w:tentative="1">
+      <w:start w:val="1"/>
+      <w:numFmt w:val="bullet"/>
+      <w:lvlText w:val=""/>
+      <w:lvlJc w:val="left"/>
+      <w:pPr>
+        <w:tabs>
+          <w:tab w:val="num" w:pos="2880"/>
+        </w:tabs>
+        <w:ind w:left="2880" w:hanging="360"/>
+      </w:pPr>
+      <w:rPr>
+        <w:rFonts w:ascii="Wingdings" w:hAnsi="Wingdings" w:hint="default"/>
+        <w:sz w:val="20"/>
+      </w:rPr>
+    </w:lvl>
+    <w:lvl w:ilvl="4" w:tentative="1">
+      <w:start w:val="1"/>
+      <w:numFmt w:val="bullet"/>
+      <w:lvlText w:val=""/>
+      <w:lvlJc w:val="left"/>
+      <w:pPr>
+        <w:tabs>
+          <w:tab w:val="num" w:pos="3600"/>
+        </w:tabs>
+        <w:ind w:left="3600" w:hanging="360"/>
+      </w:pPr>
+      <w:rPr>
+        <w:rFonts w:ascii="Wingdings" w:hAnsi="Wingdings" w:hint="default"/>
+        <w:sz w:val="20"/>
+      </w:rPr>
+    </w:lvl>
+    <w:lvl w:ilvl="5" w:tentative="1">
+      <w:start w:val="1"/>
+      <w:numFmt w:val="bullet"/>
+      <w:lvlText w:val=""/>
+      <w:lvlJc w:val="left"/>
+      <w:pPr>
+        <w:tabs>
+          <w:tab w:val="num" w:pos="4320"/>
+        </w:tabs>
+        <w:ind w:left="4320" w:hanging="360"/>
+      </w:pPr>
+      <w:rPr>
+        <w:rFonts w:ascii="Wingdings" w:hAnsi="Wingdings" w:hint="default"/>
+        <w:sz w:val="20"/>
+      </w:rPr>
+    </w:lvl>
+    <w:lvl w:ilvl="6" w:tentative="1">
+      <w:start w:val="1"/>
+      <w:numFmt w:val="bullet"/>
+      <w:lvlText w:val=""/>
+      <w:lvlJc w:val="left"/>
+      <w:pPr>
+        <w:tabs>
+          <w:tab w:val="num" w:pos="5040"/>
+        </w:tabs>
+        <w:ind w:left="5040" w:hanging="360"/>
+      </w:pPr>
+      <w:rPr>
+        <w:rFonts w:ascii="Wingdings" w:hAnsi="Wingdings" w:hint="default"/>
+        <w:sz w:val="20"/>
+      </w:rPr>
+    </w:lvl>
+    <w:lvl w:ilvl="7" w:tentative="1">
+      <w:start w:val="1"/>
+      <w:numFmt w:val="bullet"/>
+      <w:lvlText w:val=""/>
+      <w:lvlJc w:val="left"/>
+      <w:pPr>
+        <w:tabs>
+          <w:tab w:val="num" w:pos="5760"/>
+        </w:tabs>
+        <w:ind w:left="5760" w:hanging="360"/>
+      </w:pPr>
+      <w:rPr>
+        <w:rFonts w:ascii="Wingdings" w:hAnsi="Wingdings" w:hint="default"/>
+        <w:sz w:val="20"/>
+      </w:rPr>
+    </w:lvl>
+    <w:lvl w:ilvl="8" w:tentative="1">
+      <w:start w:val="1"/>
+      <w:numFmt w:val="bullet"/>
+      <w:lvlText w:val=""/>
+      <w:lvlJc w:val="left"/>
+      <w:pPr>
+        <w:tabs>
+          <w:tab w:val="num" w:pos="6480"/>
+        </w:tabs>
+        <w:ind w:left="6480" w:hanging="360"/>
+      </w:pPr>
+      <w:rPr>
+        <w:rFonts w:ascii="Wingdings" w:hAnsi="Wingdings" w:hint="default"/>
+        <w:sz w:val="20"/>
+      </w:rPr>
+    </w:lvl>
+  </w:abstractNum>
+  <w:abstractNum w:abstractNumId="8" w15:restartNumberingAfterBreak="0">
     <w:nsid w:val="67D64578"/>
     <w:multiLevelType w:val="multilevel"/>
     <w:tmpl w:val="BA4ED9A6"/>
@@ -1251,16 +2284,31 @@
     </w:lvl>
   </w:abstractNum>
   <w:num w:numId="1" w16cid:durableId="604507804">
-    <w:abstractNumId w:val="0"/>
+    <w:abstractNumId w:val="2"/>
   </w:num>
   <w:num w:numId="2" w16cid:durableId="822818952">
+    <w:abstractNumId w:val="5"/>
+  </w:num>
+  <w:num w:numId="3" w16cid:durableId="465709867">
+    <w:abstractNumId w:val="8"/>
+  </w:num>
+  <w:num w:numId="4" w16cid:durableId="123231837">
+    <w:abstractNumId w:val="6"/>
+  </w:num>
+  <w:num w:numId="5" w16cid:durableId="1062487510">
     <w:abstractNumId w:val="1"/>
   </w:num>
-  <w:num w:numId="3" w16cid:durableId="465709867">
+  <w:num w:numId="6" w16cid:durableId="1731033520">
+    <w:abstractNumId w:val="7"/>
+  </w:num>
+  <w:num w:numId="7" w16cid:durableId="1834644151">
     <w:abstractNumId w:val="3"/>
   </w:num>
-  <w:num w:numId="4" w16cid:durableId="123231837">
-    <w:abstractNumId w:val="2"/>
+  <w:num w:numId="8" w16cid:durableId="748498239">
+    <w:abstractNumId w:val="4"/>
+  </w:num>
+  <w:num w:numId="9" w16cid:durableId="1247033173">
+    <w:abstractNumId w:val="0"/>
   </w:num>
 </w:numbering>
 </file>

</xml_diff>